<commit_message>
data(c1a): làm nốt lưu ý G0-T1/T2/T4 của hội đồng 17/10 (0 agent)
- G0_KHOANG_TRONG: bỏ câu ICTRP mâu thuẫn (PI đã tra 2026-10-11); nêu đúng tệp
  còn ô [CẦN CHỦ NHIỆM GHI] (bản nháp cũ, không phải bản nộp); thêm dòng hướng
  dẫn quốc tế WHO/NICE «CHƯA rà có hệ thống — PARTIAL» (PMID 22961881).
- G0_TIM_BO_SUNG_PRISMA_S §8: ai chọn chuỗi (PI), không giới hạn ngôn ngữ/năm,
  độ đặc hiệu thấp đã biết + đã bù, chuỗi chưa ghim vào study_meta (PI ghim qua
  nút chốt G0), khuyến nghị cho lần chạy lại G0 kế tiếp.
- A1 dựng lại: khối PICO đã chốt, ô tick theo gate_params, nhận định chồng lấn
  của PI; 0 lỗi cấu trúc.

Co-Authored-By: Claude Opus 5.5 <noreply@anthropic.com>
</commit_message>
<xml_diff>
--- a/exports/hai-long-benh-nhan-C1a-BVQY175/G0_A1_PICO_FINER_hai-long-benh-nhan-C1a-BVQY175.docx
+++ b/exports/hai-long-benh-nhan-C1a-BVQY175/G0_A1_PICO_FINER_hai-long-benh-nhan-C1a-BVQY175.docx
@@ -30,7 +30,7 @@
           <w:rFonts w:ascii="Times New Roman" w:hAnsi="Times New Roman" w:eastAsia="Times New Roman"/>
           <w:sz w:val="26"/>
         </w:rPr>
-        <w:t>Ngày tạo: 2026-10-17 10:57</w:t>
+        <w:t>Ngày tạo: 2026-10-17 11:19</w:t>
       </w:r>
     </w:p>
     <w:p>
@@ -69,7 +69,7 @@
           <w:rFonts w:ascii="Times New Roman" w:hAnsi="Times New Roman" w:eastAsia="Times New Roman"/>
           <w:sz w:val="26"/>
         </w:rPr>
-        <w:t>&gt; Tạo tự động: 2026-10-17 10:57 | Truy vấn PubMed thật</w:t>
+        <w:t>&gt; Tạo tự động: 2026-10-17 11:19 | Truy vấn PubMed thật</w:t>
       </w:r>
     </w:p>
     <w:p>
@@ -171,6 +171,123 @@
           <w:rFonts w:ascii="Times New Roman" w:hAnsi="Times New Roman" w:eastAsia="Times New Roman"/>
           <w:sz w:val="26"/>
         </w:rPr>
+        <w:t>&gt; **Đã ghi trong `study_meta.json đến gate_params.G0`** — PI chốt lúc 2026-10-14T19:17:12+07:00 (vai PI; dấu vân tay lúc chốt 4678a3407d3ccd57). Khối này CHỈ ĐỌC; khung bên dưới chỉ dùng khi soạn lần đầu.</w:t>
+      </w:r>
+    </w:p>
+    <w:p>
+      <w:r>
+        <w:rPr>
+          <w:rFonts w:ascii="Times New Roman" w:hAnsi="Times New Roman" w:eastAsia="Times New Roman"/>
+          <w:sz w:val="26"/>
+        </w:rPr>
+        <w:t>&gt;</w:t>
+      </w:r>
+    </w:p>
+    <w:p>
+      <w:r>
+        <w:rPr>
+          <w:rFonts w:ascii="Times New Roman" w:hAnsi="Times New Roman" w:eastAsia="Times New Roman"/>
+          <w:sz w:val="26"/>
+        </w:rPr>
+        <w:t>&gt; - **P — Quần thể:** Người bệnh ngoại trú từ đủ 18 tuổi trở lên (kể cả phụ nữ mang thai), đủ sức khỏe và năng lực nhận thức/ngôn ngữ để trả lời, đã cơ bản hoàn thành quy trình khám tại Khoa Khám bệnh C1a, Trung tâm Khám bệnh và Điều trị theo yêu cầu C1, Bệnh viện Quân y 175, và đồng ý tham gia tự nguyện (mục 4.3.1 đề cương)</w:t>
+      </w:r>
+    </w:p>
+    <w:p>
+      <w:r>
+        <w:rPr>
+          <w:rFonts w:ascii="Times New Roman" w:hAnsi="Times New Roman" w:eastAsia="Times New Roman"/>
+          <w:sz w:val="26"/>
+        </w:rPr>
+        <w:t>&gt; - **I/E — Can thiệp/phơi nhiễm:** Không có can thiệp — nghiên cứu quan sát. Phơi nhiễm trung tâm của Mục tiêu 2 là thời gian chờ khám đo theo mốc HIS/eHospital, báo hiệu ứng theo mỗi 15 phút chờ thêm (mục 4.6.3 đề cương)</w:t>
+      </w:r>
+    </w:p>
+    <w:p>
+      <w:r>
+        <w:rPr>
+          <w:rFonts w:ascii="Times New Roman" w:hAnsi="Times New Roman" w:eastAsia="Times New Roman"/>
+          <w:sz w:val="26"/>
+        </w:rPr>
+        <w:t>&gt; - **C — So sánh:** Không có nhóm so sánh ngoài — thiết kế mô tả cắt ngang có phân tích; Mục tiêu 2 so sánh giữa các mức phơi nhiễm trong cùng một mẫu</w:t>
+      </w:r>
+    </w:p>
+    <w:p>
+      <w:r>
+        <w:rPr>
+          <w:rFonts w:ascii="Times New Roman" w:hAnsi="Times New Roman" w:eastAsia="Times New Roman"/>
+          <w:sz w:val="26"/>
+        </w:rPr>
+        <w:t>&gt; - **O — Kết cục chính:** G1 — mức hài lòng chung, hỏi trực tiếp (biến SHLNBChung_TrucTiep)</w:t>
+      </w:r>
+    </w:p>
+    <w:p>
+      <w:r>
+        <w:rPr>
+          <w:rFonts w:ascii="Times New Roman" w:hAnsi="Times New Roman" w:eastAsia="Times New Roman"/>
+          <w:sz w:val="26"/>
+        </w:rPr>
+        <w:t>&gt; - **Thang/công cụ đo kết cục chính:** Thang thứ hạng Likert 5 mức (1 = Rất không hài lòng ... 5 = Rất hài lòng); phân tích chính bằng hồi quy logistic thứ tự proportional odds, báo tỷ số chênh chung hiệu chỉnh kèm KTC 95%</w:t>
+      </w:r>
+    </w:p>
+    <w:p>
+      <w:r>
+        <w:rPr>
+          <w:rFonts w:ascii="Times New Roman" w:hAnsi="Times New Roman" w:eastAsia="Times New Roman"/>
+          <w:sz w:val="26"/>
+        </w:rPr>
+        <w:t>&gt; - **Thời điểm đo:** Đo một lần, ngay sau khi người bệnh cơ bản hoàn thành quy trình khám trong cùng lần khám</w:t>
+      </w:r>
+    </w:p>
+    <w:p>
+      <w:r>
+        <w:rPr>
+          <w:rFonts w:ascii="Times New Roman" w:hAnsi="Times New Roman" w:eastAsia="Times New Roman"/>
+          <w:sz w:val="26"/>
+        </w:rPr>
+        <w:t>&gt; - **Loại câu hỏi:** descriptive</w:t>
+      </w:r>
+    </w:p>
+    <w:p>
+      <w:r>
+        <w:rPr>
+          <w:rFonts w:ascii="Times New Roman" w:hAnsi="Times New Roman" w:eastAsia="Times New Roman"/>
+          <w:sz w:val="26"/>
+        </w:rPr>
+        <w:t>&gt; - **Loại kiểm định:** descriptive</w:t>
+      </w:r>
+    </w:p>
+    <w:p>
+      <w:r>
+        <w:rPr>
+          <w:rFonts w:ascii="Times New Roman" w:hAnsi="Times New Roman" w:eastAsia="Times New Roman"/>
+          <w:sz w:val="26"/>
+        </w:rPr>
+        <w:t>&gt; - **H0:** Ở người bệnh ngoại trú Khoa C1a, sau hiệu chỉnh các biến gây nhiễu đã khoá theo DAG (SAP §5), thời gian chờ khám theo mốc HIS (mỗi 15 phút) không liên quan với mức hài lòng chung G1: OR chung = 1.</w:t>
+      </w:r>
+    </w:p>
+    <w:p>
+      <w:r>
+        <w:rPr>
+          <w:rFonts w:ascii="Times New Roman" w:hAnsi="Times New Roman" w:eastAsia="Times New Roman"/>
+          <w:sz w:val="26"/>
+        </w:rPr>
+        <w:t>&gt; - **H1:** OR chung khác 1 (kiểm định hai phía, alpha = 0,05).</w:t>
+      </w:r>
+    </w:p>
+    <w:p>
+      <w:r>
+        <w:rPr>
+          <w:rFonts w:ascii="Times New Roman" w:hAnsi="Times New Roman" w:eastAsia="Times New Roman"/>
+          <w:sz w:val="26"/>
+        </w:rPr>
+        <w:t>&gt; - **Chiều kỳ vọng:** Chờ lâu hơn liên quan với G1 thấp hơn: OR chung cho mức G1 cao hơn, mỗi 15 phút chờ thêm, &lt; 1 (Quyen 2021, PMID 34017606 — ngoại trú Việt Nam, bằng chứng gián tiếp).</w:t>
+      </w:r>
+    </w:p>
+    <w:p>
+      <w:r>
+        <w:rPr>
+          <w:rFonts w:ascii="Times New Roman" w:hAnsi="Times New Roman" w:eastAsia="Times New Roman"/>
+          <w:sz w:val="26"/>
+        </w:rPr>
         <w:t>**Topic đề tài:** Sự hài lòng của bệnh nhân trong hoạt động khám chữa bệnh tại Khoa Khám bệnh theo yêu cầu, bệnh viện quân y tuyến cuối</w:t>
       </w:r>
     </w:p>
@@ -718,7 +835,7 @@
           <w:rFonts w:ascii="Times New Roman" w:hAnsi="Times New Roman" w:eastAsia="Times New Roman"/>
           <w:sz w:val="26"/>
         </w:rPr>
-        <w:t xml:space="preserve"> đến Có thể cập nhật SR/MA hiện có hoặc nghiên cứu quần thể cụ thể | [Lưu ý] ClinicalTrials.gov: 3 nghiên cứu ĐANG/SẮP TUYỂN cho truy vấn này (tổng 5 hồ sơ đăng ký). 'Chưa công bố' KHÔNG có nghĩa 'chưa ai làm' — đọc các hồ sơ ở §3.6 trước khi biện minh tính mới; nguy cơ trùng đề tài thật.</w:t>
+        <w:t xml:space="preserve"> đến Có thể cập nhật SR/MA hiện có hoặc nghiên cứu quần thể cụ thể | [Lưu ý] ClinicalTrials.gov: 3 nghiên cứu ĐANG/SẮP TUYỂN cho truy vấn này (tổng 5 hồ sơ đăng ký). 'Chưa công bố' KHÔNG có nghĩa 'chưa ai làm' — đọc các hồ sơ ở §3.6 trước khi biện minh tính mới; nguy cơ trùng đề tài thật. — PI ĐÃ ĐÁNH GIÁ chồng lấn (gate_params.G0.registry_overlap_assessment): Không chồng lấn với câu hỏi đề tài: NCT07602231 (Anterior Cruciate Ligament Rupture, Enhanced Recovery After Surgery (ERAS) Protocol, Ambulatory Surgery); NCT07555704 (Rotator Cuff Tear, Telemedecine, Rotator Cuff Injuries); NCT07540637 (Chronic Hepatitis B) — theo tiêu đề và bệnh/tình trạng đăng ký, đều là thử nghiệm can thiệp cho vấn đề khác, không phải khảo sát hài lòng với dịch vụ khám ngoại trú theo yêu cầu.</w:t>
       </w:r>
     </w:p>
     <w:p>
@@ -2552,7 +2669,7 @@
           <w:rFonts w:ascii="Times New Roman" w:hAnsi="Times New Roman" w:eastAsia="Times New Roman"/>
           <w:sz w:val="26"/>
         </w:rPr>
-        <w:t>**Đối chiếu đăng ký:** [Lưu ý] ClinicalTrials.gov: 3 nghiên cứu ĐANG/SẮP TUYỂN cho truy vấn này (tổng 5 hồ sơ đăng ký). 'Chưa công bố' KHÔNG có nghĩa 'chưa ai làm' — đọc các hồ sơ ở §3.6 trước khi biện minh tính mới; nguy cơ trùng đề tài thật.</w:t>
+        <w:t>**Đối chiếu đăng ký:** [Lưu ý] ClinicalTrials.gov: 3 nghiên cứu ĐANG/SẮP TUYỂN cho truy vấn này (tổng 5 hồ sơ đăng ký). 'Chưa công bố' KHÔNG có nghĩa 'chưa ai làm' — đọc các hồ sơ ở §3.6 trước khi biện minh tính mới; nguy cơ trùng đề tài thật. — PI ĐÃ ĐÁNH GIÁ chồng lấn (gate_params.G0.registry_overlap_assessment): Không chồng lấn với câu hỏi đề tài: NCT07602231 (Anterior Cruciate Ligament Rupture, Enhanced Recovery After Surgery (ERAS) Protocol, Ambulatory Surgery); NCT07555704 (Rotator Cuff Tear, Telemedecine, Rotator Cuff Injuries); NCT07540637 (Chronic Hepatitis B) — theo tiêu đề và bệnh/tình trạng đăng ký, đều là thử nghiệm can thiệp cho vấn đề khác, không phải khảo sát hài lòng với dịch vụ khám ngoại trú theo yêu cầu.</w:t>
       </w:r>
     </w:p>
     <w:p>
@@ -2654,6 +2771,15 @@
           <w:rFonts w:ascii="Times New Roman" w:hAnsi="Times New Roman" w:eastAsia="Times New Roman"/>
           <w:sz w:val="26"/>
         </w:rPr>
+        <w:t>| Hướng dẫn quốc tế về trải nghiệm/hài lòng người bệnh (WHO, NICE…) | — | CHƯA rà có hệ thống (ghi 2026-10-17); NICE có hướng dẫn về trải nghiệm người bệnh — bài xã luận về triển khai: PMID 22961881 (Evid Based Nurs 2012); trang NICE có lúc trả 403 với IP VPN | PARTIAL — chưa đọc văn bản hướng dẫn quốc tế; đề tài đo hài lòng theo khung QĐ 56/QĐ-BYT nên kết luận tính mới không dựa vào hướng dẫn quốc tế | nguồn không phân hạng |</w:t>
+      </w:r>
+    </w:p>
+    <w:p>
+      <w:r>
+        <w:rPr>
+          <w:rFonts w:ascii="Times New Roman" w:hAnsi="Times New Roman" w:eastAsia="Times New Roman"/>
+          <w:sz w:val="26"/>
+        </w:rPr>
         <w:t>**Phát biểu khoảng trống:** Trong phạm vi đã tra (PubMed tới 2026-10-17, Europe PMC, Crossref tiếng Việt — §7 G0_TIM_BO_SUNG_PRISMA_S), đã có khảo sát hài lòng ngoại trú tại khoa khám theo yêu cầu (doi:10.52163/yhc.v67icd5.5018), tại bệnh viện quân y (doi:10.52163/yhc.v64i1.573) và tại BV Quân y 175 ở khoa YHCT (doi:10.52163/yhc.v66i1.1940), nhưng chưa thấy nghiên cứu tại Khoa C1a. Thời gian chờ từ phần mềm/HIS đã có (PMID 28690831; PMID 29915440) nhưng chưa thấy nghiên cứu gắn hài lòng với thời gian chờ lấy từ mốc HIS (bài gắn hai yếu tố dùng tự báo, PMID 34017606); đa mức cấp cơ sở/tỉnh đã có, chưa thấy ICC theo bàn khám.</w:t>
       </w:r>
     </w:p>
@@ -2691,7 +2817,7 @@
           <w:color w:val="CC4400"/>
           <w:sz w:val="26"/>
         </w:rPr>
-        <w:t>**Ghi chú nguồn:** PubMed «partial»: một chuỗi MeSH + từ tự do PI chọn (chạy lại 2026-10-14) kèm nhánh KHÔNG lọc thiết kế để đối chiếu recall; Europe PMC 3 nhánh (2026-10-14, gói G0_TIM_BO_SUNG_PRISMA_S) + nguồn bổ sung — chưa phải tổng quan hệ thống. ClinicalTrials.gov: tra lại 2026-10-14 bằng chuỗi PubMed đã bỏ thẻ trường — 5 hồ sơ khớp chữ, 3 đang/sắp tuyển (NCT07602231, NCT07555704, NCT07540637); theo tiêu đề cả 5 khác chủ đề (phẫu thuật dây chằng, phục hồi chóp xoay, viêm gan B, trầm cảm, PTSD) — PI đánh giá chồng lấn ở G0-HUMAN-08 (chủ yếu phủ thử nghiệm can thiệp). WHO ICTRP không có API — PI tự tra rồi ghi gate_params.G0.registry_manual_checked.ictrp. Nguồn trong nước (Tạp chí Y học Việt Nam, Y Dược học Quân sự…): đề cương §3.5 còn ô [CẦN CHỦ NHIỆM GHI]. Bổ sung 2026-10-11: nguồn trong nước tra qua Crossref (2 truy vấn tiếng Việt) — «partial»: chỉ phủ tạp chí có DOI; WHO ICTRP PI đã tự tra 2026-10-11. Bổ sung 2026-10-17: lượt tìm nhắm đúng thời gian chờ × hài lòng và ICC/đa mức trên PubMed, Europe PMC, Crossref tiếng Việt (§7 G0_TIM_BO_SUNG_PRISMA_S).</w:t>
+        <w:t>**Ghi chú nguồn:** PubMed «partial»: một chuỗi MeSH + từ tự do PI chọn (chạy lại 2026-10-14) kèm nhánh KHÔNG lọc thiết kế để đối chiếu recall; Europe PMC 3 nhánh (2026-10-14, gói G0_TIM_BO_SUNG_PRISMA_S) + nguồn bổ sung — chưa phải tổng quan hệ thống. ClinicalTrials.gov: tra lại 2026-10-14 bằng chuỗi PubMed đã bỏ thẻ trường — 5 hồ sơ khớp chữ, 3 đang/sắp tuyển (NCT07602231, NCT07555704, NCT07540637); theo tiêu đề cả 5 khác chủ đề (phẫu thuật dây chằng, phục hồi chóp xoay, viêm gan B, trầm cảm, PTSD) — PI đánh giá chồng lấn ở G0-HUMAN-08 (chủ yếu phủ thử nghiệm can thiệp). WHO ICTRP không có API — PI đã tự tra 2026-10-11 (gate_params.G0.registry_manual_checked.ictrp). Nguồn trong nước (Tạp chí Y học Việt Nam, Y Dược học Quân sự…): bản nháp cũ De-cuong_Hai-long-C1a_BVQY175.md (dòng 154, §3.5) còn ô [CẦN CHỦ NHIỆM GHI]; bản nộp Hội đồng DE_CUONG_NOP_HOI_DONG_hai-long-benh-nhan-C1a-BVQY175.md Bảng 3.1 đã điền đủ chiến lược tìm. Bổ sung 2026-10-11: nguồn trong nước tra qua Crossref (2 truy vấn tiếng Việt) — «partial»: chỉ phủ tạp chí có DOI; WHO ICTRP PI đã tự tra 2026-10-11. Bổ sung 2026-10-17: lượt tìm nhắm đúng thời gian chờ × hài lòng và ICC/đa mức trên PubMed, Europe PMC, Crossref tiếng Việt (§7 G0_TIM_BO_SUNG_PRISMA_S).</w:t>
       </w:r>
     </w:p>
     <w:p>
@@ -2944,79 +3070,79 @@
           <w:rFonts w:ascii="Times New Roman" w:hAnsi="Times New Roman" w:eastAsia="Times New Roman"/>
           <w:sz w:val="26"/>
         </w:rPr>
-        <w:t>PHẦN CHỈ BÁC SĨ QUYẾT ĐƯỢC (hệ KHÔNG tự điền)</w:t>
-      </w:r>
-    </w:p>
-    <w:p>
-      <w:r>
-        <w:rPr>
-          <w:rFonts w:ascii="Times New Roman" w:hAnsi="Times New Roman" w:eastAsia="Times New Roman"/>
-          <w:sz w:val="26"/>
-        </w:rPr>
-        <w:t>[ ] PICO/PECO 4 thành phần đến gate_params.G0.population/intervention/comparison/outcomes</w:t>
-      </w:r>
-    </w:p>
-    <w:p>
-      <w:r>
-        <w:rPr>
-          <w:rFonts w:ascii="Times New Roman" w:hAnsi="Times New Roman" w:eastAsia="Times New Roman"/>
-          <w:sz w:val="26"/>
-        </w:rPr>
-        <w:t>[ ] Kết cục CHÍNH duy nhất + thang đo + thời điểm đến .primary_outcome{,_measure,_timepoint}</w:t>
-      </w:r>
-    </w:p>
-    <w:p>
-      <w:r>
-        <w:rPr>
-          <w:rFonts w:ascii="Times New Roman" w:hAnsi="Times New Roman" w:eastAsia="Times New Roman"/>
-          <w:sz w:val="26"/>
-        </w:rPr>
-        <w:t>[ ] Giả thuyết H0/H1 + chiều kỳ vọng đến .hypothesis_h0/.hypothesis_h1/.expected_direction</w:t>
-      </w:r>
-    </w:p>
-    <w:p>
-      <w:r>
-        <w:rPr>
-          <w:rFonts w:ascii="Times New Roman" w:hAnsi="Times New Roman" w:eastAsia="Times New Roman"/>
-          <w:sz w:val="26"/>
-        </w:rPr>
-        <w:t>[ ] Loại câu hỏi + loại kiểm định đến .question_type/.test_type</w:t>
-      </w:r>
-    </w:p>
-    <w:p>
-      <w:r>
-        <w:rPr>
-          <w:rFonts w:ascii="Times New Roman" w:hAnsi="Times New Roman" w:eastAsia="Times New Roman"/>
-          <w:sz w:val="26"/>
-        </w:rPr>
-        <w:t>[ ] FINER 5 tiêu chí, MỖI khoá một câu «ĐẠT — &lt;lý do&gt;» đến .finer_feasible/_interesting/_novel/_ethical/_relevant</w:t>
-      </w:r>
-    </w:p>
-    <w:p>
-      <w:r>
-        <w:rPr>
-          <w:rFonts w:ascii="Times New Roman" w:hAnsi="Times New Roman" w:eastAsia="Times New Roman"/>
-          <w:sz w:val="26"/>
-        </w:rPr>
-        <w:t>[ ] Đã đọc lại bằng chứng + biện minh tính mới (bỏ nhãn [DỰ THẢO …]) đến .evidence_reviewed_confirmed/.novelty_justification</w:t>
-      </w:r>
-    </w:p>
-    <w:p>
-      <w:r>
-        <w:rPr>
-          <w:rFonts w:ascii="Times New Roman" w:hAnsi="Times New Roman" w:eastAsia="Times New Roman"/>
-          <w:sz w:val="26"/>
-        </w:rPr>
-        <w:t>[ ] Tự tra WHO ICTRP, ghi NGÀY tra đến .registry_manual_checked = {"ictrp": "YYYY-MM-DD"}</w:t>
-      </w:r>
-    </w:p>
-    <w:p>
-      <w:r>
-        <w:rPr>
-          <w:rFonts w:ascii="Times New Roman" w:hAnsi="Times New Roman" w:eastAsia="Times New Roman"/>
-          <w:sz w:val="26"/>
-        </w:rPr>
-        <w:t>[ ] Chốt PICO (vai trò + thời điểm + dấu nội dung) đến .pico_confirmed/.reviewed_by_role/.reviewed_at/.dau_van_tay_chot</w:t>
+        <w:t>PHẦN CHỈ BÁC SĨ QUYẾT ĐƯỢC (hệ KHÔNG tự điền; [x] = ĐÃ GHI trong gate_params — đạt hay không do bộ chấm quyết)</w:t>
+      </w:r>
+    </w:p>
+    <w:p>
+      <w:r>
+        <w:rPr>
+          <w:rFonts w:ascii="Times New Roman" w:hAnsi="Times New Roman" w:eastAsia="Times New Roman"/>
+          <w:sz w:val="26"/>
+        </w:rPr>
+        <w:t>[x] PICO/PECO 4 thành phần đến gate_params.G0.population/intervention/comparison/outcomes</w:t>
+      </w:r>
+    </w:p>
+    <w:p>
+      <w:r>
+        <w:rPr>
+          <w:rFonts w:ascii="Times New Roman" w:hAnsi="Times New Roman" w:eastAsia="Times New Roman"/>
+          <w:sz w:val="26"/>
+        </w:rPr>
+        <w:t>[x] Kết cục CHÍNH duy nhất + thang đo + thời điểm đến .primary_outcome{,_measure,_timepoint}</w:t>
+      </w:r>
+    </w:p>
+    <w:p>
+      <w:r>
+        <w:rPr>
+          <w:rFonts w:ascii="Times New Roman" w:hAnsi="Times New Roman" w:eastAsia="Times New Roman"/>
+          <w:sz w:val="26"/>
+        </w:rPr>
+        <w:t>[x] Giả thuyết H0/H1 + chiều kỳ vọng đến .hypothesis_h0/.hypothesis_h1/.expected_direction</w:t>
+      </w:r>
+    </w:p>
+    <w:p>
+      <w:r>
+        <w:rPr>
+          <w:rFonts w:ascii="Times New Roman" w:hAnsi="Times New Roman" w:eastAsia="Times New Roman"/>
+          <w:sz w:val="26"/>
+        </w:rPr>
+        <w:t>[x] Loại câu hỏi + loại kiểm định đến .question_type/.test_type</w:t>
+      </w:r>
+    </w:p>
+    <w:p>
+      <w:r>
+        <w:rPr>
+          <w:rFonts w:ascii="Times New Roman" w:hAnsi="Times New Roman" w:eastAsia="Times New Roman"/>
+          <w:sz w:val="26"/>
+        </w:rPr>
+        <w:t>[x] FINER 5 tiêu chí, MỖI khoá một câu «ĐẠT — &lt;lý do&gt;» đến .finer_feasible/_interesting/_novel/_ethical/_relevant</w:t>
+      </w:r>
+    </w:p>
+    <w:p>
+      <w:r>
+        <w:rPr>
+          <w:rFonts w:ascii="Times New Roman" w:hAnsi="Times New Roman" w:eastAsia="Times New Roman"/>
+          <w:sz w:val="26"/>
+        </w:rPr>
+        <w:t>[x] Đã đọc lại bằng chứng + biện minh tính mới (bỏ nhãn [DỰ THẢO …]) đến .evidence_reviewed_confirmed/.novelty_justification</w:t>
+      </w:r>
+    </w:p>
+    <w:p>
+      <w:r>
+        <w:rPr>
+          <w:rFonts w:ascii="Times New Roman" w:hAnsi="Times New Roman" w:eastAsia="Times New Roman"/>
+          <w:sz w:val="26"/>
+        </w:rPr>
+        <w:t>[x] Tự tra WHO ICTRP, ghi NGÀY tra đến .registry_manual_checked = {"ictrp": "YYYY-MM-DD"}</w:t>
+      </w:r>
+    </w:p>
+    <w:p>
+      <w:r>
+        <w:rPr>
+          <w:rFonts w:ascii="Times New Roman" w:hAnsi="Times New Roman" w:eastAsia="Times New Roman"/>
+          <w:sz w:val="26"/>
+        </w:rPr>
+        <w:t>[x] Chốt PICO (vai trò + thời điểm + dấu nội dung) đến .pico_confirmed/.reviewed_by_role/.reviewed_at/.dau_van_tay_chot</w:t>
       </w:r>
     </w:p>
     <w:p>
@@ -3026,6 +3152,15 @@
           <w:sz w:val="26"/>
         </w:rPr>
         <w:t>**Hành động tiếp theo của bác sĩ** (danh sách SỐNG luôn ở `python3 tools/hoi_dong_cong.py cham-song --study hai-long-benh-nhan-C1a-BVQY175 --gate G0`):</w:t>
+      </w:r>
+    </w:p>
+    <w:p>
+      <w:r>
+        <w:rPr>
+          <w:rFonts w:ascii="Times New Roman" w:hAnsi="Times New Roman" w:eastAsia="Times New Roman"/>
+          <w:sz w:val="26"/>
+        </w:rPr>
+        <w:t>&gt; PI đã chốt G0 lúc 2026-10-14T19:17:12+07:00. Nếu bộ chấm báo dấu vân tay lệch (G0-HUMAN-07) thì chỉ cần chốt lại; các bước 1–4 dưới đây là quy trình lần đầu.</w:t>
       </w:r>
     </w:p>
     <w:p>

</xml_diff>

<commit_message>
data(c1a): hoàn thiện G1 — sổ bằng chứng A2b từ sàng lọc G0; bản Word phụ trợ G1 cập nhật
- G1 A2b dựng lại (--dung-lai-ho-tro): 39 dòng có thiết kế + tóm tắt + trạng
  thái từ sàng lọc G0-T3; 11 bài lạc đề sang mục riêng; còn đúng 38 ô «thẩm định
  RoB — đọc toàn văn» (việc người thật). Trước: ~161 nhãn [CẦN].
- G0: PMID 22961881 (xã luận NICE, dòng hướng dẫn quốc tế) vào nguồn bổ sung,
  nhãn gián tiếp, rút bài OK; A1 dựng lại; kiểm máy G0-T3 SẠCH.
- .docx A1b/A2b/A13/A13b xuất lại chuẩn (hết «bản in cũ hơn .md»).
- G1-T4 khai ÁP DỤNG, G1-T8 KHÔNG (khai-ap-dung ở hồ sơ hội đồng, ngoài git).

Co-Authored-By: Claude Opus 5.5 <noreply@anthropic.com>
</commit_message>
<xml_diff>
--- a/exports/hai-long-benh-nhan-C1a-BVQY175/G0_A1_PICO_FINER_hai-long-benh-nhan-C1a-BVQY175.docx
+++ b/exports/hai-long-benh-nhan-C1a-BVQY175/G0_A1_PICO_FINER_hai-long-benh-nhan-C1a-BVQY175.docx
@@ -30,7 +30,7 @@
           <w:rFonts w:ascii="Times New Roman" w:hAnsi="Times New Roman" w:eastAsia="Times New Roman"/>
           <w:sz w:val="26"/>
         </w:rPr>
-        <w:t>Ngày tạo: 2026-10-17 11:19</w:t>
+        <w:t>Ngày tạo: 2026-10-17 11:34</w:t>
       </w:r>
     </w:p>
     <w:p>
@@ -69,7 +69,7 @@
           <w:rFonts w:ascii="Times New Roman" w:hAnsi="Times New Roman" w:eastAsia="Times New Roman"/>
           <w:sz w:val="26"/>
         </w:rPr>
-        <w:t>&gt; Tạo tự động: 2026-10-17 11:19 | Truy vấn PubMed thật</w:t>
+        <w:t>&gt; Tạo tự động: 2026-10-17 11:34 | Truy vấn PubMed thật</w:t>
       </w:r>
     </w:p>
     <w:p>
@@ -1679,6 +1679,15 @@
           <w:sz w:val="26"/>
         </w:rPr>
         <w:t>| 16162387 | Healthcare in the New Vietnam: comparing patients' satisfaction with outpatient care in a traditional neighborhood clinic and a new, western-style clinic in Ho Chi Minh City (Soc Sci Med, 2005) | Cắt ngang so sánh, phỏng vấn 194 người bệnh tại hai phòng khám tư nhân (kiểu phương Tây và kiểu ngoài giờ truyền thống) | gián tiếp | Người bệnh ở phòng khám kiểu phương Tây có kỳ vọng và mức hài lòng cao hơn ở nhiều khía cạnh, dựa vào cách giao tiếp và cách cung cấp dịch vụ hơn là tay nghề — liên quan tới dịch vụ khám theo yêu cầu/trả phí. | PubMed · nhánh khong_loc của truy vấn G0 — bản ghi vượt trần 30, lấy nốt qua connector PubMed · 2026-10-17 |</w:t>
+      </w:r>
+    </w:p>
+    <w:p>
+      <w:r>
+        <w:rPr>
+          <w:rFonts w:ascii="Times New Roman" w:hAnsi="Times New Roman" w:eastAsia="Times New Roman"/>
+          <w:sz w:val="26"/>
+        </w:rPr>
+        <w:t>| 22961881 | Can we help patients have a better experience? Implementing NICE guidance on patient experience (Evid Based Nurs, 2012) | Xã luận (editorial) — không có tóm tắt trên PubMed | gián tiếp | Bàn về triển khai hướng dẫn của NICE về trải nghiệm người bệnh; chỉ dùng để khai phạm vi rà hướng dẫn quốc tế (dòng «Hướng dẫn quốc tế … PARTIAL» của G0_KHOANG_TRONG), không làm căn cứ số liệu. | PubMed — giám khảo G0-T4 nêu (biên bản G0-DG-20261017T100650-2569dc49, RQ5); xác minh metadata qua connector PubMed 2026-10-17 |</w:t>
       </w:r>
     </w:p>
     <w:p>

</xml_diff>